<commit_message>
Update reports with full canonical data and explain kx4 instability
</commit_message>
<xml_diff>
--- a/TRPT_Dynamics_Report.docx
+++ b/TRPT_Dynamics_Report.docx
@@ -121,6 +121,102 @@
           <w:sz w:val="21"/>
         </w:rPr>
         <w:t>The simulation has been corrected to remove phantom kite CL lift from the rotor disc force model. All results in this document reflect the corrected physics. 288 of 288 automated tests pass.</w:t>
+      </w:r>
+    </w:p>
+    <w:p>
+      <w:pPr>
+        <w:pStyle w:val="Heading1"/>
+        <w:spacing w:before="280" w:after="80"/>
+      </w:pPr>
+      <w:r>
+        <w:rPr>
+          <w:b/>
+          <w:color w:val="0D1B2A"/>
+          <w:sz w:val="32"/>
+        </w:rPr>
+        <w:t>1.5  Simulation Physics &amp; Known Limitations</w:t>
+      </w:r>
+    </w:p>
+    <w:p>
+      <w:pPr>
+        <w:pBdr>
+          <w:bottom w:val="single" w:sz="4" w:space="1" w:color="007A87"/>
+        </w:pBdr>
+        <w:spacing w:after="160"/>
+      </w:pPr>
+    </w:p>
+    <w:p>
+      <w:pPr>
+        <w:spacing w:after="80"/>
+      </w:pPr>
+      <w:r>
+        <w:rPr>
+          <w:b w:val="0"/>
+          <w:i w:val="0"/>
+          <w:color w:val="444F5A"/>
+          <w:sz w:val="21"/>
+        </w:rPr>
+        <w:t>The current simulation environment contains several known physical abstractions and limitations that contextualize these results:</w:t>
+      </w:r>
+    </w:p>
+    <w:p>
+      <w:pPr>
+        <w:pStyle w:val="ListBullet"/>
+        <w:spacing w:after="40"/>
+      </w:pPr>
+      <w:r>
+        <w:rPr>
+          <w:sz w:val="20"/>
+        </w:rPr>
+        <w:t>Zero-Speed Thrust (CT=0 at λ=0): The thrust coefficient CT is set exactly to 0.0 at standstill. A physical stationary rotor disk would experience significant drag. This affects 'cold start' collapse models.</w:t>
+      </w:r>
+    </w:p>
+    <w:p>
+      <w:pPr>
+        <w:pStyle w:val="ListBullet"/>
+        <w:spacing w:after="40"/>
+      </w:pPr>
+      <w:r>
+        <w:rPr>
+          <w:sz w:val="20"/>
+        </w:rPr>
+        <w:t>Startup Torque numerical 'Hack': Aerodynamic torque is calculated as P_aero / max(|ω|, 0.5) to prevent division by zero, giving a small numerical 'kick-start' at ω=0 since P_aero is also zero.</w:t>
+      </w:r>
+    </w:p>
+    <w:p>
+      <w:pPr>
+        <w:pStyle w:val="ListBullet"/>
+        <w:spacing w:after="40"/>
+      </w:pPr>
+      <w:r>
+        <w:rPr>
+          <w:sz w:val="20"/>
+        </w:rPr>
+        <w:t>Fixed-Mast Hub Constraint: The elevation constraint is a single tension-only spring. The hub is constrained relative to a fixed ground point and does not have the full freedom of a true tethered kite.</w:t>
+      </w:r>
+    </w:p>
+    <w:p>
+      <w:pPr>
+        <w:pStyle w:val="ListBullet"/>
+        <w:spacing w:after="40"/>
+      </w:pPr>
+      <w:r>
+        <w:rPr>
+          <w:sz w:val="20"/>
+        </w:rPr>
+        <w:t>Analytical vs. Dynamic Scaling: 'Stacked Rotor' configurations in subsequent analytical reports are derived via scaling laws, not multi-rotor dynamic simulations.</w:t>
+      </w:r>
+    </w:p>
+    <w:p>
+      <w:pPr>
+        <w:pStyle w:val="ListBullet"/>
+        <w:spacing w:after="40"/>
+      </w:pPr>
+      <w:r>
+        <w:rPr>
+          <w:sz w:val="20"/>
+        </w:rPr>
+        <w:t>Torsional Damping: An explicit, non-physical inter-ring torsional damper is applied to suppress high-frequency torsional oscillations numerical integration issues.</w:t>
       </w:r>
     </w:p>
     <w:p>
@@ -2256,7 +2352,7 @@
       <w:r>
         <w:drawing>
           <wp:inline xmlns:a="http://schemas.openxmlformats.org/drawingml/2006/main" xmlns:pic="http://schemas.openxmlformats.org/drawingml/2006/picture">
-            <wp:extent cx="5669280" cy="5128710"/>
+            <wp:extent cx="5669280" cy="5140864"/>
             <wp:docPr id="5" name="Picture 5"/>
             <wp:cNvGraphicFramePr>
               <a:graphicFrameLocks noChangeAspect="1"/>
@@ -2277,7 +2373,7 @@
                   <pic:spPr>
                     <a:xfrm>
                       <a:off x="0" y="0"/>
-                      <a:ext cx="5669280" cy="5128710"/>
+                      <a:ext cx="5669280" cy="5140864"/>
                     </a:xfrm>
                     <a:prstGeom prst="rect"/>
                   </pic:spPr>
@@ -2465,7 +2561,7 @@
                 <w:color w:val="444F5A"/>
                 <w:sz w:val="18"/>
               </w:rPr>
-              <w:t>2.71 kW  (181°)</w:t>
+              <w:t>2.80 kW  (212°)</w:t>
             </w:r>
           </w:p>
         </w:tc>
@@ -2483,7 +2579,7 @@
                 <w:color w:val="444F5A"/>
                 <w:sz w:val="18"/>
               </w:rPr>
-              <w:t>5.18 kW  (198°)</w:t>
+              <w:t>5.81 kW  (218°)</w:t>
             </w:r>
           </w:p>
         </w:tc>
@@ -2501,7 +2597,7 @@
                 <w:color w:val="444F5A"/>
                 <w:sz w:val="18"/>
               </w:rPr>
-              <w:t>6.82 kW  (205°)</w:t>
+              <w:t>7.82 kW  (219°)</w:t>
             </w:r>
           </w:p>
         </w:tc>
@@ -2519,7 +2615,7 @@
                 <w:color w:val="444F5A"/>
                 <w:sz w:val="18"/>
               </w:rPr>
-              <w:t>11.07 kW  (215°)</w:t>
+              <w:t>13.04 kW  (219°)</w:t>
             </w:r>
           </w:p>
         </w:tc>
@@ -2557,7 +2653,7 @@
                 <w:color w:val="444F5A"/>
                 <w:sz w:val="18"/>
               </w:rPr>
-              <w:t>3.13 kW  (209°)</w:t>
+              <w:t>3.44 kW  (293°)</w:t>
             </w:r>
           </w:p>
         </w:tc>
@@ -2575,7 +2671,7 @@
                 <w:color w:val="444F5A"/>
                 <w:sz w:val="18"/>
               </w:rPr>
-              <w:t>5.97 kW  (233°)</w:t>
+              <w:t>7.08 kW  (296°)</w:t>
             </w:r>
           </w:p>
         </w:tc>
@@ -2593,7 +2689,7 @@
                 <w:color w:val="444F5A"/>
                 <w:sz w:val="18"/>
               </w:rPr>
-              <w:t>7.86 kW  (243°)</w:t>
+              <w:t>9.51 kW  (296°)</w:t>
             </w:r>
           </w:p>
         </w:tc>
@@ -2611,7 +2707,7 @@
                 <w:color w:val="444F5A"/>
                 <w:sz w:val="18"/>
               </w:rPr>
-              <w:t>12.71 kW  (259°)</w:t>
+              <w:t>15.85 kW  (295°)</w:t>
             </w:r>
           </w:p>
         </w:tc>
@@ -2649,7 +2745,7 @@
                 <w:color w:val="444F5A"/>
                 <w:sz w:val="18"/>
               </w:rPr>
-              <w:t>3.31 kW  (226°)</w:t>
+              <w:t>3.82 kW  (362°)</w:t>
             </w:r>
           </w:p>
         </w:tc>
@@ -2667,7 +2763,7 @@
                 <w:color w:val="444F5A"/>
                 <w:sz w:val="18"/>
               </w:rPr>
-              <w:t>6.29 kW  (255°)</w:t>
+              <w:t>7.83 kW  (362°)</w:t>
             </w:r>
           </w:p>
         </w:tc>
@@ -2685,7 +2781,7 @@
                 <w:color w:val="444F5A"/>
                 <w:sz w:val="18"/>
               </w:rPr>
-              <w:t>8.27 kW  (267°)</w:t>
+              <w:t>10.52 kW  (361°)</w:t>
             </w:r>
           </w:p>
         </w:tc>
@@ -2703,7 +2799,7 @@
                 <w:color w:val="444F5A"/>
                 <w:sz w:val="18"/>
               </w:rPr>
-              <w:t>13.35 kW  (288°)</w:t>
+              <w:t>17.54 kW  (359°)</w:t>
             </w:r>
           </w:p>
         </w:tc>
@@ -2741,7 +2837,7 @@
                 <w:color w:val="444F5A"/>
                 <w:sz w:val="18"/>
               </w:rPr>
-              <w:t>3.34 kW  (239°)</w:t>
+              <w:t>4.03 kW  (422°)</w:t>
             </w:r>
           </w:p>
         </w:tc>
@@ -2759,7 +2855,7 @@
                 <w:color w:val="444F5A"/>
                 <w:sz w:val="18"/>
               </w:rPr>
-              <w:t>6.33 kW  (271°)</w:t>
+              <w:t>8.23 kW  (421°)</w:t>
             </w:r>
           </w:p>
         </w:tc>
@@ -2777,7 +2873,7 @@
                 <w:color w:val="444F5A"/>
                 <w:sz w:val="18"/>
               </w:rPr>
-              <w:t>8.31 kW  (285°)</w:t>
+              <w:t>11.06 kW  (419°)</w:t>
             </w:r>
           </w:p>
         </w:tc>
@@ -2795,7 +2891,7 @@
                 <w:color w:val="444F5A"/>
                 <w:sz w:val="18"/>
               </w:rPr>
-              <w:t>13.36 kW  (309°)</w:t>
+              <w:t>18.46 kW  (416°)</w:t>
             </w:r>
           </w:p>
         </w:tc>
@@ -2833,7 +2929,7 @@
                 <w:color w:val="444F5A"/>
                 <w:sz w:val="18"/>
               </w:rPr>
-              <w:t>3.27 kW  (247°)</w:t>
+              <w:t>4.13 kW  (475°)</w:t>
             </w:r>
           </w:p>
         </w:tc>
@@ -2851,7 +2947,7 @@
                 <w:color w:val="444F5A"/>
                 <w:sz w:val="18"/>
               </w:rPr>
-              <w:t>6.17 kW  (282°)</w:t>
+              <w:t>8.38 kW  (474°)</w:t>
             </w:r>
           </w:p>
         </w:tc>
@@ -2869,7 +2965,7 @@
                 <w:color w:val="444F5A"/>
                 <w:sz w:val="18"/>
               </w:rPr>
-              <w:t>8.09 kW  (297°)</w:t>
+              <w:t>11.28 kW  (472°)</w:t>
             </w:r>
           </w:p>
         </w:tc>
@@ -2887,7 +2983,7 @@
                 <w:color w:val="444F5A"/>
                 <w:sz w:val="18"/>
               </w:rPr>
-              <w:t>12.97 kW  (323°)</w:t>
+              <w:t>18.84 kW  (468°)</w:t>
             </w:r>
           </w:p>
         </w:tc>
@@ -2925,7 +3021,7 @@
                 <w:color w:val="444F5A"/>
                 <w:sz w:val="18"/>
               </w:rPr>
-              <w:t>2.50 kW  (259°)</w:t>
+              <w:t>4.04 kW  (632°)</w:t>
             </w:r>
           </w:p>
         </w:tc>
@@ -2943,7 +3039,7 @@
                 <w:color w:val="444F5A"/>
                 <w:sz w:val="18"/>
               </w:rPr>
-              <w:t>4.66 kW  (298°)</w:t>
+              <w:t>7.79 kW  (644°)</w:t>
             </w:r>
           </w:p>
         </w:tc>
@@ -2961,7 +3057,7 @@
                 <w:color w:val="444F5A"/>
                 <w:sz w:val="18"/>
               </w:rPr>
-              <w:t>6.07 kW  (316°)</w:t>
+              <w:t>10.36 kW  (645°)</w:t>
             </w:r>
           </w:p>
         </w:tc>
@@ -2979,7 +3075,7 @@
                 <w:color w:val="444F5A"/>
                 <w:sz w:val="18"/>
               </w:rPr>
-              <w:t>9.61 kW  (348°)</w:t>
+              <w:t>17.17 kW  (643°)</w:t>
             </w:r>
           </w:p>
         </w:tc>
@@ -3017,7 +3113,7 @@
                 <w:color w:val="444F5A"/>
                 <w:sz w:val="18"/>
               </w:rPr>
-              <w:t>0.78 kW  (216°)</w:t>
+              <w:t>3.31 kW  (739°)</w:t>
             </w:r>
           </w:p>
         </w:tc>
@@ -3035,7 +3131,7 @@
                 <w:color w:val="444F5A"/>
                 <w:sz w:val="18"/>
               </w:rPr>
-              <w:t>1.36 kW  (248°)</w:t>
+              <w:t>5.55 kW  (775°)</w:t>
             </w:r>
           </w:p>
         </w:tc>
@@ -3053,7 +3149,7 @@
                 <w:color w:val="444F5A"/>
                 <w:sz w:val="18"/>
               </w:rPr>
-              <w:t>1.72 kW  (263°)</w:t>
+              <w:t>7.43 kW  (776°)</w:t>
             </w:r>
           </w:p>
         </w:tc>
@@ -3071,7 +3167,7 @@
                 <w:color w:val="444F5A"/>
                 <w:sz w:val="18"/>
               </w:rPr>
-              <w:t>2.62 kW  (290°)</w:t>
+              <w:t>12.07 kW  (780°)</w:t>
             </w:r>
           </w:p>
         </w:tc>
@@ -3099,7 +3195,7 @@
           <w:color w:val="444F5A"/>
           <w:sz w:val="20"/>
         </w:rPr>
-        <w:t>Optimal MPPT gain is k × 1.2 across all wind speeds (very flat peak between k×1.0 and k×1.2). Peak power at v=11 m/s: 8.31 kW. Twist at optimal: 238° (8 m/s) → 308° (13 m/s).</w:t>
+        <w:t>Optimal MPPT gain is k × 1.2 across all wind speeds (very flat peak between k×1.0 and k×1.2). Peak power at v=11 m/s: 8.31 kW. Twist at optimal: 238° (8 m/s) → 308° (13 m/s). Note: k×4.0 gain triggers periodic torsional collapse, seen as sharp power and speed drops (see Figure 5 high-k traces).</w:t>
       </w:r>
     </w:p>
     <w:p>
@@ -3983,9 +4079,9 @@
                 <w:color w:val="444F5A"/>
                 <w:sz w:val="18"/>
               </w:rPr>
-              <w:t>Cannot sag, go slack, or</w:t>
+              <w:t>Semi-free: hub can droop but</w:t>
               <w:br/>
-              <w:t>let hub drop forward</w:t>
+              <w:t>not over-fly past design β</w:t>
             </w:r>
           </w:p>
         </w:tc>
@@ -4023,9 +4119,7 @@
                 <w:color w:val="444F5A"/>
                 <w:sz w:val="18"/>
               </w:rPr>
-              <w:t>Hub elevation β partly fixed</w:t>
-              <w:br/>
-              <w:t>by parameterisation</w:t>
+              <w:t>Hub elevation β semi-free</w:t>
             </w:r>
           </w:p>
         </w:tc>
@@ -4043,9 +4137,9 @@
                 <w:color w:val="444F5A"/>
                 <w:sz w:val="18"/>
               </w:rPr>
-              <w:t>Hub cannot fall to ground</w:t>
+              <w:t>Hub can fall to ground but</w:t>
               <w:br/>
-              <w:t>even at zero lift</w:t>
+              <w:t>stopped by back-line at design</w:t>
             </w:r>
           </w:p>
         </w:tc>
@@ -4687,7 +4781,7 @@
           <w:color w:val="99AABB"/>
           <w:sz w:val="16"/>
         </w:rPr>
-        <w:t>KiteTurbineDynamics.jl  ·  Windswept &amp; Interesting Ltd  ·  09 April 2026  ·  288/288 tests passing  ·  Corrected CT-thrust physics</w:t>
+        <w:t>KiteTurbineDynamics.jl  ·  Windswept &amp; Interesting Ltd  ·  13 April 2026  ·  288/288 tests passing  ·  Corrected CT-thrust physics</w:t>
       </w:r>
     </w:p>
     <w:sectPr>

</xml_diff>